<commit_message>
Updated Bible resource content for Arabic, English, French, Gujarati, Hindi, Indonesian, Portuguese, Spanish, and Chinese
</commit_message>
<xml_diff>
--- a/arb/docx/59.content.docx
+++ b/arb/docx/59.content.docx
@@ -61991,6 +61991,23 @@
           <w:b/>
           <w:lang w:val="ar_AE" w:bidi="ar_AE"/>
         </w:rPr>
+        <w:t>οἱ λέγοντες</w:t>
+      </w:r>
+    </w:p>
+    <w:p>
+      <w:pPr>
+        <w:bidi/>
+      </w:pPr>
+      <w:r>
+        <w:rPr>
+          <w:lang w:val="ar_AE" w:bidi="ar_AE"/>
+        </w:rPr>
+      </w:r>
+      <w:r>
+        <w:rPr>
+          <w:b/>
+          <w:lang w:val="ar_AE" w:bidi="ar_AE"/>
+        </w:rPr>
         <w:t>"أَيُّهَا الْقَائِلُونَ"</w:t>
       </w:r>
     </w:p>
@@ -62007,7 +62024,7 @@
         <w:rPr>
           <w:lang w:val="ar_AE" w:bidi="ar_AE"/>
         </w:rPr>
-        <w:t>يخاطب يعقوب قرَّاءه بصيغة النداء. إذا كانت لُغتك تحتوي على صيغة النداء، فمن المناسب استخدامها هنا. إذا لم تكن كذلك، يمكنك التعبير عن المعنى بطريقة أخرى تكون مُستساغة في لُغتك. (إذا استخدمت الكلمة "أنتم"، ستكون بصيغة الجمع، لأن يعقوب يخاطب مجموعة من الناس). التَّرْجَمَة البديلة: "أنتم الذين تقولون"</w:t>
+        <w:t>التَّرْجَمَة البديلة: "أنتم الذين تقولون"</w:t>
       </w:r>
       <w:r>
         <w:rPr>

</xml_diff>